<commit_message>
Resnotif form update and minor tweaks
* Replaced default resnotif with one updated for research site manager change
* The previous one with janderso is in archive/ (though we could just remove)
* Minor tweaks to the index formatting of logos
* Added a networking page to IM manual - WIP
</commit_message>
<xml_diff>
--- a/templates/Jornada_resnotif_form.docx
+++ b/templates/Jornada_resnotif_form.docx
@@ -296,7 +296,15 @@
         <w:t>Final Approval Date</w:t>
       </w:r>
       <w:r>
-        <w:t xml:space="preserve"> (mm/dd/yyyy)</w:t>
+        <w:t xml:space="preserve"> (mm/dd/</w:t>
+      </w:r>
+      <w:proofErr w:type="spellStart"/>
+      <w:r>
+        <w:t>yyyy</w:t>
+      </w:r>
+      <w:proofErr w:type="spellEnd"/>
+      <w:r>
+        <w:t>)</w:t>
       </w:r>
       <w:r>
         <w:rPr>
@@ -857,7 +865,39 @@
           <w:i/>
           <w:iCs/>
         </w:rPr>
-        <w:t>(Submit a shapefile, geodatabase or kmz/kml file with potential study site location(s) and area(s) of interest. If only coordinates are available, please provide the source information and a description of how coordinates were derived (e.g., coordinates were obtained with a GPS unit (include make/model information) or points were created in Google Earth, etc.).  This information will be used to determine if your potential sites conflict with existing research.)</w:t>
+        <w:t xml:space="preserve">(Submit a shapefile, geodatabase or </w:t>
+      </w:r>
+      <w:proofErr w:type="spellStart"/>
+      <w:r>
+        <w:rPr>
+          <w:i/>
+          <w:iCs/>
+        </w:rPr>
+        <w:t>kmz</w:t>
+      </w:r>
+      <w:proofErr w:type="spellEnd"/>
+      <w:r>
+        <w:rPr>
+          <w:i/>
+          <w:iCs/>
+        </w:rPr>
+        <w:t>/</w:t>
+      </w:r>
+      <w:proofErr w:type="spellStart"/>
+      <w:r>
+        <w:rPr>
+          <w:i/>
+          <w:iCs/>
+        </w:rPr>
+        <w:t>kml</w:t>
+      </w:r>
+      <w:proofErr w:type="spellEnd"/>
+      <w:r>
+        <w:rPr>
+          <w:i/>
+          <w:iCs/>
+        </w:rPr>
+        <w:t xml:space="preserve"> file with potential study site location(s) and area(s) of interest. If only coordinates are available, please provide the source information and a description of how coordinates were derived (e.g., coordinates were obtained with a GPS unit (include make/model information) or points were created in Google Earth, etc.).  This information will be used to determine if your potential sites conflict with existing research.)</w:t>
       </w:r>
       <w:r>
         <w:rPr>
@@ -1068,7 +1108,15 @@
       </w:pPr>
       <w:r>
         <w:tab/>
-        <w:t>(JER Scientist/staff, NMSU Faculty, Staff, Post-doc, Ph.D. student, Masters student, Undergraduate, REU student, other Federal agency, State agency, Jornada LTER investigator, Other (describe))</w:t>
+        <w:t xml:space="preserve">(JER Scientist/staff, NMSU Faculty, Staff, Post-doc, Ph.D. student, </w:t>
+      </w:r>
+      <w:proofErr w:type="gramStart"/>
+      <w:r>
+        <w:t>Masters</w:t>
+      </w:r>
+      <w:proofErr w:type="gramEnd"/>
+      <w:r>
+        <w:t xml:space="preserve"> student, Undergraduate, REU student, other Federal agency, State agency, Jornada LTER investigator, Other (describe))</w:t>
       </w:r>
     </w:p>
     <w:p>
@@ -1955,7 +2003,15 @@
           <w:i/>
           <w:iCs/>
         </w:rPr>
-        <w:t>(of individual plots, samples, plants, etc.)</w:t>
+        <w:t>(of individual plots, samples, plants, etc.</w:t>
+      </w:r>
+      <w:proofErr w:type="gramStart"/>
+      <w:r>
+        <w:rPr>
+          <w:i/>
+          <w:iCs/>
+        </w:rPr>
+        <w:t>)</w:t>
       </w:r>
       <w:r>
         <w:t xml:space="preserve"> </w:t>
@@ -1965,7 +2021,15 @@
           <w:b/>
           <w:bCs/>
         </w:rPr>
-        <w:t xml:space="preserve">: </w:t>
+        <w:t>:</w:t>
+      </w:r>
+      <w:proofErr w:type="gramEnd"/>
+      <w:r>
+        <w:rPr>
+          <w:b/>
+          <w:bCs/>
+        </w:rPr>
+        <w:t xml:space="preserve"> </w:t>
       </w:r>
     </w:p>
     <w:p>
@@ -2132,8 +2196,18 @@
           <w:bCs/>
           <w:i/>
         </w:rPr>
-        <w:t>If Yes</w:t>
-      </w:r>
+        <w:t xml:space="preserve">If </w:t>
+      </w:r>
+      <w:proofErr w:type="gramStart"/>
+      <w:r>
+        <w:rPr>
+          <w:b/>
+          <w:bCs/>
+          <w:i/>
+        </w:rPr>
+        <w:t>Yes</w:t>
+      </w:r>
+      <w:proofErr w:type="gramEnd"/>
       <w:r>
         <w:rPr>
           <w:bCs/>
@@ -2293,7 +2367,23 @@
           <w:b/>
           <w:bCs/>
         </w:rPr>
-        <w:t>If Yes,</w:t>
+        <w:t xml:space="preserve">If </w:t>
+      </w:r>
+      <w:proofErr w:type="gramStart"/>
+      <w:r>
+        <w:rPr>
+          <w:b/>
+          <w:bCs/>
+        </w:rPr>
+        <w:t>Yes</w:t>
+      </w:r>
+      <w:proofErr w:type="gramEnd"/>
+      <w:r>
+        <w:rPr>
+          <w:b/>
+          <w:bCs/>
+        </w:rPr>
+        <w:t>,</w:t>
       </w:r>
       <w:r>
         <w:t xml:space="preserve"> what is the status of application?</w:t>
@@ -2333,7 +2423,23 @@
           <w:b/>
           <w:bCs/>
         </w:rPr>
-        <w:t>If Yes, you must:</w:t>
+        <w:t xml:space="preserve">If </w:t>
+      </w:r>
+      <w:proofErr w:type="gramStart"/>
+      <w:r>
+        <w:rPr>
+          <w:b/>
+          <w:bCs/>
+        </w:rPr>
+        <w:t>Yes</w:t>
+      </w:r>
+      <w:proofErr w:type="gramEnd"/>
+      <w:r>
+        <w:rPr>
+          <w:b/>
+          <w:bCs/>
+        </w:rPr>
+        <w:t>, you must:</w:t>
       </w:r>
     </w:p>
     <w:p>
@@ -2463,7 +2569,23 @@
           <w:b/>
           <w:bCs/>
         </w:rPr>
-        <w:t>What is the design of your study?  Transect ___ Grid ___ Point  ___ Other _________________________</w:t>
+        <w:t xml:space="preserve">What is the design of your study?  Transect ___ Grid ___ </w:t>
+      </w:r>
+      <w:proofErr w:type="gramStart"/>
+      <w:r>
+        <w:rPr>
+          <w:b/>
+          <w:bCs/>
+        </w:rPr>
+        <w:t>Point  _</w:t>
+      </w:r>
+      <w:proofErr w:type="gramEnd"/>
+      <w:r>
+        <w:rPr>
+          <w:b/>
+          <w:bCs/>
+        </w:rPr>
+        <w:t>__ Other _________________________</w:t>
       </w:r>
     </w:p>
     <w:p>
@@ -2668,7 +2790,15 @@
           <w:b/>
           <w:bCs/>
         </w:rPr>
-        <w:t xml:space="preserve">. If research is to be conducted on the USDA Jornada Experimental Range (JER), does the principal investigator(s) have a current JER federal permit on file with USDA JER? If not, contact Nicki Daniels at </w:t>
+        <w:t xml:space="preserve">. If research is to be conducted on the USDA Jornada Experimental Range (JER), does the principal </w:t>
+      </w:r>
+      <w:r>
+        <w:rPr>
+          <w:b/>
+          <w:bCs/>
+        </w:rPr>
+        <w:lastRenderedPageBreak/>
+        <w:t xml:space="preserve">investigator(s) have a current JER federal permit on file with USDA JER? If not, contact Nicki Daniels at </w:t>
       </w:r>
       <w:hyperlink r:id="rId7" w:history="1">
         <w:r>
@@ -2701,7 +2831,14 @@
         <w:rPr>
           <w:bCs/>
         </w:rPr>
-        <w:t xml:space="preserve">Mark one: Yes    No    </w:t>
+        <w:t xml:space="preserve">Mark one: Yes    No </w:t>
+      </w:r>
+      <w:proofErr w:type="gramStart"/>
+      <w:r>
+        <w:rPr>
+          <w:bCs/>
+        </w:rPr>
+        <w:t xml:space="preserve">   </w:t>
       </w:r>
       <w:r>
         <w:rPr>
@@ -2709,6 +2846,7 @@
         </w:rPr>
         <w:t>“</w:t>
       </w:r>
+      <w:proofErr w:type="gramEnd"/>
       <w:r>
         <w:rPr>
           <w:bCs/>
@@ -2805,13 +2943,27 @@
         <w:rPr>
           <w:bCs/>
         </w:rPr>
-        <w:t xml:space="preserve">Mark one: Yes    No    </w:t>
-      </w:r>
-      <w:r>
-        <w:rPr>
-          <w:bCs/>
-        </w:rPr>
-        <w:t>“Not applicable”</w:t>
+        <w:t xml:space="preserve">Mark one: Yes    No </w:t>
+      </w:r>
+      <w:proofErr w:type="gramStart"/>
+      <w:r>
+        <w:rPr>
+          <w:bCs/>
+        </w:rPr>
+        <w:t xml:space="preserve">   </w:t>
+      </w:r>
+      <w:r>
+        <w:rPr>
+          <w:bCs/>
+        </w:rPr>
+        <w:t>“</w:t>
+      </w:r>
+      <w:proofErr w:type="gramEnd"/>
+      <w:r>
+        <w:rPr>
+          <w:bCs/>
+        </w:rPr>
+        <w:t>Not applicable”</w:t>
       </w:r>
       <w:r>
         <w:rPr>
@@ -2951,7 +3103,15 @@
       </w:r>
       <w:r>
         <w:tab/>
-        <w:t>(mm/dd/yyyy)</w:t>
+        <w:t>(mm/dd/</w:t>
+      </w:r>
+      <w:proofErr w:type="spellStart"/>
+      <w:r>
+        <w:t>yyyy</w:t>
+      </w:r>
+      <w:proofErr w:type="spellEnd"/>
+      <w:r>
+        <w:t>)</w:t>
       </w:r>
     </w:p>
     <w:p>
@@ -2966,8 +3126,13 @@
         </w:tabs>
       </w:pPr>
       <w:r>
-        <w:t>Brandon Bestelmeyer</w:t>
-      </w:r>
+        <w:t xml:space="preserve">Brandon </w:t>
+      </w:r>
+      <w:proofErr w:type="spellStart"/>
+      <w:r>
+        <w:t>Bestelmeyer</w:t>
+      </w:r>
+      <w:proofErr w:type="spellEnd"/>
       <w:r>
         <w:tab/>
       </w:r>
@@ -3013,7 +3178,7 @@
         </w:tabs>
       </w:pPr>
       <w:r>
-        <w:t>John Anderson</w:t>
+        <w:t>Conrad Nelson</w:t>
       </w:r>
       <w:r>
         <w:tab/>
@@ -3022,12 +3187,13 @@
         <w:r>
           <w:rPr>
             <w:rStyle w:val="Hyperlink"/>
-            <w:sz w:val="18"/>
-            <w:szCs w:val="18"/>
           </w:rPr>
-          <w:t>646-5818/janderso@nmsu.edu</w:t>
+          <w:t>cwnelson@nmsu.edu</w:t>
         </w:r>
       </w:hyperlink>
+      <w:r>
+        <w:tab/>
+      </w:r>
       <w:r>
         <w:rPr>
           <w:sz w:val="18"/>
@@ -3594,14 +3760,20 @@
         <w:t>nsult the Jornada websites,</w:t>
       </w:r>
       <w:r>
-        <w:t xml:space="preserve"> John Anderson (</w:t>
+        <w:t xml:space="preserve"> </w:t>
+      </w:r>
+      <w:r>
+        <w:t>Conrad Nelson</w:t>
+      </w:r>
+      <w:r>
+        <w:t xml:space="preserve"> (</w:t>
       </w:r>
       <w:hyperlink r:id="rId13" w:history="1">
         <w:r>
           <w:rPr>
             <w:rStyle w:val="Hyperlink"/>
           </w:rPr>
-          <w:t>janderso@nmsu.edu</w:t>
+          <w:t>cwnelson@nmsu.edu</w:t>
         </w:r>
       </w:hyperlink>
       <w:r>
@@ -3618,7 +3790,7 @@
           <w:rPr>
             <w:rStyle w:val="Hyperlink"/>
           </w:rPr>
-          <w:t>datamanager.jrn.lter@gmail.com</w:t>
+          <w:t>jornada.data@nmsu.edu</w:t>
         </w:r>
       </w:hyperlink>
       <w:r>
@@ -3989,17 +4161,19 @@
       <w:tblPr>
         <w:tblStyle w:val="TableGrid"/>
         <w:tblW w:w="0" w:type="auto"/>
-        <w:tblInd w:w="360" w:type="dxa"/>
+        <w:jc w:val="center"/>
         <w:tblLook w:val="04A0" w:firstRow="1" w:lastRow="0" w:firstColumn="1" w:lastColumn="0" w:noHBand="0" w:noVBand="1"/>
       </w:tblPr>
       <w:tblGrid>
-        <w:gridCol w:w="4519"/>
-        <w:gridCol w:w="4471"/>
+        <w:gridCol w:w="4627"/>
       </w:tblGrid>
       <w:tr>
+        <w:trPr>
+          <w:jc w:val="center"/>
+        </w:trPr>
         <w:tc>
           <w:tcPr>
-            <w:tcW w:w="4675" w:type="dxa"/>
+            <w:tcW w:w="4627" w:type="dxa"/>
           </w:tcPr>
           <w:p>
             <w:pPr>
@@ -4012,71 +4186,31 @@
               <w:t xml:space="preserve"> to</w:t>
             </w:r>
             <w:r>
-              <w:rPr>
-                <w:color w:val="0000FF"/>
-                <w:u w:val="single"/>
-              </w:rPr>
-              <w:t>:</w:t>
+              <w:t xml:space="preserve">: </w:t>
+            </w:r>
+            <w:r>
+              <w:t>LTER Information Manager (</w:t>
+            </w:r>
+            <w:r>
+              <w:fldChar w:fldCharType="begin"/>
+            </w:r>
+            <w:r>
+              <w:instrText>HYPERLINK "mailto:jornada.data@nmsu.edu"</w:instrText>
+            </w:r>
+            <w:r>
+              <w:fldChar w:fldCharType="separate"/>
             </w:r>
             <w:r>
               <w:rPr>
-                <w:color w:val="0000FF"/>
-                <w:u w:val="single"/>
+                <w:rStyle w:val="Hyperlink"/>
               </w:rPr>
-              <w:t xml:space="preserve"> </w:t>
+              <w:t>jornada.data@nmsu.edu</w:t>
             </w:r>
-            <w:hyperlink r:id="rId15" w:history="1">
-              <w:r>
-                <w:rPr>
-                  <w:rStyle w:val="Hyperlink"/>
-                </w:rPr>
-                <w:t>janderso@nmsu.edu</w:t>
-              </w:r>
-            </w:hyperlink>
-          </w:p>
-        </w:tc>
-        <w:tc>
-          <w:tcPr>
-            <w:tcW w:w="4675" w:type="dxa"/>
-          </w:tcPr>
-          <w:p>
-            <w:pPr>
-              <w:ind w:left="990"/>
-            </w:pPr>
             <w:r>
-              <w:t>John Anderson</w:t>
+              <w:fldChar w:fldCharType="end"/>
             </w:r>
-          </w:p>
-          <w:p>
-            <w:pPr>
-              <w:ind w:left="990"/>
-            </w:pPr>
             <w:r>
-              <w:t>USDA Jornada Experimental Range</w:t>
-            </w:r>
-          </w:p>
-          <w:p>
-            <w:pPr>
-              <w:ind w:left="990"/>
-            </w:pPr>
-            <w:r>
-              <w:t>New Mexico State University</w:t>
-            </w:r>
-          </w:p>
-          <w:p>
-            <w:pPr>
-              <w:ind w:left="990"/>
-            </w:pPr>
-            <w:r>
-              <w:t>P.O. Box 30003, MSC 3JER</w:t>
-            </w:r>
-          </w:p>
-          <w:p>
-            <w:pPr>
-              <w:ind w:left="990"/>
-            </w:pPr>
-            <w:r>
-              <w:t>Las Cruces, NM 88003-8003</w:t>
+              <w:t>)</w:t>
             </w:r>
           </w:p>
         </w:tc>
@@ -4109,7 +4243,7 @@
       <w:r>
         <w:t xml:space="preserve"> (</w:t>
       </w:r>
-      <w:hyperlink r:id="rId16" w:history="1">
+      <w:hyperlink r:id="rId15" w:history="1">
         <w:r>
           <w:rPr>
             <w:rStyle w:val="Hyperlink"/>
@@ -4120,7 +4254,7 @@
       <w:r>
         <w:t>) and LTER Network (</w:t>
       </w:r>
-      <w:hyperlink r:id="rId17" w:history="1">
+      <w:hyperlink r:id="rId16" w:history="1">
         <w:r>
           <w:rPr>
             <w:rStyle w:val="Hyperlink"/>
@@ -4398,16 +4532,16 @@
       <w:r>
         <w:t>Contact the Jornada Information Management team (</w:t>
       </w:r>
-      <w:hyperlink r:id="rId18" w:history="1">
+      <w:hyperlink r:id="rId17" w:history="1">
         <w:r>
           <w:rPr>
             <w:rStyle w:val="Hyperlink"/>
           </w:rPr>
-          <w:t>datamanager.jrn.lter@gmail.co</w:t>
+          <w:t>jornada.data@nmsu.edu</w:t>
         </w:r>
       </w:hyperlink>
       <w:r>
-        <w:t>m) for more information or to submit data.</w:t>
+        <w:t>) for more information or to submit data.</w:t>
       </w:r>
     </w:p>
     <w:p>
@@ -4448,7 +4582,14 @@
         <w:rPr>
           <w:bCs/>
         </w:rPr>
-        <w:t xml:space="preserve">The Jornada Experimental Range is administered by the USDA ARS for long-term research by USDA staff and is closed to the public. The </w:t>
+        <w:t xml:space="preserve">The Jornada Experimental Range is administered by the USDA ARS for long-term research by USDA staff and is </w:t>
+      </w:r>
+      <w:r>
+        <w:rPr>
+          <w:bCs/>
+        </w:rPr>
+        <w:lastRenderedPageBreak/>
+        <w:t xml:space="preserve">closed to the public. The </w:t>
       </w:r>
       <w:r>
         <w:rPr>
@@ -4578,7 +4719,7 @@
         </w:rPr>
         <w:t xml:space="preserve"> </w:t>
       </w:r>
-      <w:hyperlink r:id="rId19" w:history="1">
+      <w:hyperlink r:id="rId18" w:history="1">
         <w:r>
           <w:rPr>
             <w:rStyle w:val="Hyperlink"/>
@@ -4589,7 +4730,7 @@
       <w:r>
         <w:t xml:space="preserve">; </w:t>
       </w:r>
-      <w:hyperlink r:id="rId20" w:history="1">
+      <w:hyperlink r:id="rId19" w:history="1">
         <w:r>
           <w:rPr>
             <w:rStyle w:val="Hyperlink"/>
@@ -4797,7 +4938,15 @@
         <w:t xml:space="preserve">8. Person(s) responsible for carrying out study/sampling:  </w:t>
       </w:r>
       <w:r>
-        <w:t xml:space="preserve">It is the person (or persons) responsible for execution of the study; the person (or persons) who actually conducts the study.  This might be the same as the Principal Investigator.  It might also be the student whose project it is, other collaborating scientist, or staff researcher.  </w:t>
+        <w:t xml:space="preserve">It is the person (or persons) responsible for execution of the study; the person (or persons) who </w:t>
+      </w:r>
+      <w:proofErr w:type="gramStart"/>
+      <w:r>
+        <w:t>actually conducts</w:t>
+      </w:r>
+      <w:proofErr w:type="gramEnd"/>
+      <w:r>
+        <w:t xml:space="preserve"> the study.  This might be the same as the Principal Investigator.  It might also be the student whose project it is, other collaborating scientist, or staff researcher.  </w:t>
       </w:r>
     </w:p>
     <w:p>
@@ -4837,7 +4986,23 @@
           <w:b/>
           <w:bCs/>
         </w:rPr>
-        <w:t xml:space="preserve">__  Other: </w:t>
+        <w:t>_</w:t>
+      </w:r>
+      <w:proofErr w:type="gramStart"/>
+      <w:r>
+        <w:rPr>
+          <w:b/>
+          <w:bCs/>
+        </w:rPr>
+        <w:t>_  Other</w:t>
+      </w:r>
+      <w:proofErr w:type="gramEnd"/>
+      <w:r>
+        <w:rPr>
+          <w:b/>
+          <w:bCs/>
+        </w:rPr>
+        <w:t xml:space="preserve">: </w:t>
       </w:r>
       <w:r>
         <w:t>Give full name. Do not use acronyms.</w:t>
@@ -5310,7 +5475,15 @@
         <w:pStyle w:val="BodyTextIndent"/>
       </w:pPr>
       <w:r>
-        <w:t>Benomyl is used as a protective and eradicant fungicide.  Benomyl released to soil will not tend to leach, but volatilization of benomyl from soil may be significant.</w:t>
+        <w:t xml:space="preserve">Benomyl is used as a protective and </w:t>
+      </w:r>
+      <w:proofErr w:type="spellStart"/>
+      <w:r>
+        <w:t>eradicant</w:t>
+      </w:r>
+      <w:proofErr w:type="spellEnd"/>
+      <w:r>
+        <w:t xml:space="preserve"> fungicide.  Benomyl released to soil will not tend to leach, but volatilization of benomyl from soil may be significant.</w:t>
       </w:r>
     </w:p>
     <w:p>
@@ -5344,7 +5517,15 @@
         <w:pStyle w:val="BodyTextIndent"/>
       </w:pPr>
       <w:r>
-        <w:t>Benomyl released to water will have a low to moderate tendency to sorb to sediments, suspended sediments and biota and will not tend to bioconcentrate.  No information was found about volatilization from water.  In water, benomyl will hydrolyze.  One study reported that the conversion of benomyl (approx 40 ppm) to methyl 2-benzimidazole carbamate (MBC) was complete within one week.</w:t>
+        <w:t>Benomyl released to water will have a low to moderate tendency to sorb to sediments, suspended sediments and biota and will not tend to bioconcentrate.  No information was found about volatilization from water.  In water, benomyl will hydrolyze.  One study reported that the conversion of benomyl (</w:t>
+      </w:r>
+      <w:proofErr w:type="spellStart"/>
+      <w:r>
+        <w:t>approx</w:t>
+      </w:r>
+      <w:proofErr w:type="spellEnd"/>
+      <w:r>
+        <w:t xml:space="preserve"> 40 ppm) to methyl 2-benzimidazole carbamate (MBC) was complete within one week.</w:t>
       </w:r>
     </w:p>
     <w:p>
@@ -5387,7 +5568,31 @@
         <w:t>14</w:t>
       </w:r>
       <w:r>
-        <w:t>C ring-labeled benomyl, during 6 and 12 months incubation periods, occurred only in nonsterilized soil.  Ring cleavage of the benzimizazole nucleus and metabolism of this moiety of CO</w:t>
+        <w:t xml:space="preserve">C ring-labeled benomyl, during </w:t>
+      </w:r>
+      <w:proofErr w:type="gramStart"/>
+      <w:r>
+        <w:t>6 and 12 months</w:t>
+      </w:r>
+      <w:proofErr w:type="gramEnd"/>
+      <w:r>
+        <w:t xml:space="preserve"> incubation periods, occurred only in </w:t>
+      </w:r>
+      <w:proofErr w:type="spellStart"/>
+      <w:r>
+        <w:t>nonsterilized</w:t>
+      </w:r>
+      <w:proofErr w:type="spellEnd"/>
+      <w:r>
+        <w:t xml:space="preserve"> soil.  Ring cleavage of the </w:t>
+      </w:r>
+      <w:proofErr w:type="spellStart"/>
+      <w:r>
+        <w:t>benzimizazole</w:t>
+      </w:r>
+      <w:proofErr w:type="spellEnd"/>
+      <w:r>
+        <w:t xml:space="preserve"> nucleus and metabolism of this moiety of CO</w:t>
       </w:r>
       <w:r>
         <w:rPr>
@@ -5823,7 +6028,12 @@
       </w:r>
     </w:p>
     <w:sectPr>
-      <w:footerReference w:type="default" r:id="rId21"/>
+      <w:headerReference w:type="even" r:id="rId20"/>
+      <w:headerReference w:type="default" r:id="rId21"/>
+      <w:footerReference w:type="even" r:id="rId22"/>
+      <w:footerReference w:type="default" r:id="rId23"/>
+      <w:headerReference w:type="first" r:id="rId24"/>
+      <w:footerReference w:type="first" r:id="rId25"/>
       <w:endnotePr>
         <w:numFmt w:val="decimal"/>
       </w:endnotePr>
@@ -5856,6 +6066,16 @@
 </file>
 
 <file path=word/footer1.xml><?xml version="1.0" encoding="utf-8"?>
+<w:ftr xmlns:wpc="http://schemas.microsoft.com/office/word/2010/wordprocessingCanvas" xmlns:cx="http://schemas.microsoft.com/office/drawing/2014/chartex" xmlns:cx1="http://schemas.microsoft.com/office/drawing/2015/9/8/chartex" xmlns:cx2="http://schemas.microsoft.com/office/drawing/2015/10/21/chartex" xmlns:cx3="http://schemas.microsoft.com/office/drawing/2016/5/9/chartex" xmlns:cx4="http://schemas.microsoft.com/office/drawing/2016/5/10/chartex" xmlns:cx5="http://schemas.microsoft.com/office/drawing/2016/5/11/chartex" xmlns:cx6="http://schemas.microsoft.com/office/drawing/2016/5/12/chartex" xmlns:cx7="http://schemas.microsoft.com/office/drawing/2016/5/13/chartex" xmlns:cx8="http://schemas.microsoft.com/office/drawing/2016/5/14/chartex" xmlns:mc="http://schemas.openxmlformats.org/markup-compatibility/2006" xmlns:aink="http://schemas.microsoft.com/office/drawing/2016/ink" xmlns:am3d="http://schemas.microsoft.com/office/drawing/2017/model3d" xmlns:o="urn:schemas-microsoft-com:office:office" xmlns:oel="http://schemas.microsoft.com/office/2019/extlst" xmlns:r="http://schemas.openxmlformats.org/officeDocument/2006/relationships" xmlns:m="http://schemas.openxmlformats.org/officeDocument/2006/math" xmlns:v="urn:schemas-microsoft-com:vml" xmlns:wp14="http://schemas.microsoft.com/office/word/2010/wordprocessingDrawing" xmlns:wp="http://schemas.openxmlformats.org/drawingml/2006/wordprocessingDrawing" xmlns:w10="urn:schemas-microsoft-com:office:word" xmlns:w="http://schemas.openxmlformats.org/wordprocessingml/2006/main" xmlns:w14="http://schemas.microsoft.com/office/word/2010/wordml" xmlns:w15="http://schemas.microsoft.com/office/word/2012/wordml" xmlns:w16cex="http://schemas.microsoft.com/office/word/2018/wordml/cex" xmlns:w16cid="http://schemas.microsoft.com/office/word/2016/wordml/cid" xmlns:w16="http://schemas.microsoft.com/office/word/2018/wordml" xmlns:w16du="http://schemas.microsoft.com/office/word/2023/wordml/word16du" xmlns:w16sdtdh="http://schemas.microsoft.com/office/word/2020/wordml/sdtdatahash" xmlns:w16sdtfl="http://schemas.microsoft.com/office/word/2024/wordml/sdtformatlock" xmlns:w16se="http://schemas.microsoft.com/office/word/2015/wordml/symex" xmlns:wpg="http://schemas.microsoft.com/office/word/2010/wordprocessingGroup" xmlns:wpi="http://schemas.microsoft.com/office/word/2010/wordprocessingInk" xmlns:wne="http://schemas.microsoft.com/office/word/2006/wordml" xmlns:wps="http://schemas.microsoft.com/office/word/2010/wordprocessingShape" mc:Ignorable="w14 w15 w16se w16cid w16 w16cex w16sdtdh w16sdtfl w16du wp14">
+  <w:p>
+    <w:pPr>
+      <w:pStyle w:val="Footer"/>
+    </w:pPr>
+  </w:p>
+</w:ftr>
+</file>
+
+<file path=word/footer2.xml><?xml version="1.0" encoding="utf-8"?>
 <w:ftr xmlns:wpc="http://schemas.microsoft.com/office/word/2010/wordprocessingCanvas" xmlns:cx="http://schemas.microsoft.com/office/drawing/2014/chartex" xmlns:cx1="http://schemas.microsoft.com/office/drawing/2015/9/8/chartex" xmlns:cx2="http://schemas.microsoft.com/office/drawing/2015/10/21/chartex" xmlns:cx3="http://schemas.microsoft.com/office/drawing/2016/5/9/chartex" xmlns:cx4="http://schemas.microsoft.com/office/drawing/2016/5/10/chartex" xmlns:cx5="http://schemas.microsoft.com/office/drawing/2016/5/11/chartex" xmlns:cx6="http://schemas.microsoft.com/office/drawing/2016/5/12/chartex" xmlns:cx7="http://schemas.microsoft.com/office/drawing/2016/5/13/chartex" xmlns:cx8="http://schemas.microsoft.com/office/drawing/2016/5/14/chartex" xmlns:mc="http://schemas.openxmlformats.org/markup-compatibility/2006" xmlns:aink="http://schemas.microsoft.com/office/drawing/2016/ink" xmlns:am3d="http://schemas.microsoft.com/office/drawing/2017/model3d" xmlns:o="urn:schemas-microsoft-com:office:office" xmlns:oel="http://schemas.microsoft.com/office/2019/extlst" xmlns:r="http://schemas.openxmlformats.org/officeDocument/2006/relationships" xmlns:m="http://schemas.openxmlformats.org/officeDocument/2006/math" xmlns:v="urn:schemas-microsoft-com:vml" xmlns:wp14="http://schemas.microsoft.com/office/word/2010/wordprocessingDrawing" xmlns:wp="http://schemas.openxmlformats.org/drawingml/2006/wordprocessingDrawing" xmlns:w10="urn:schemas-microsoft-com:office:word" xmlns:w="http://schemas.openxmlformats.org/wordprocessingml/2006/main" xmlns:w14="http://schemas.microsoft.com/office/word/2010/wordml" xmlns:w15="http://schemas.microsoft.com/office/word/2012/wordml" xmlns:w16cex="http://schemas.microsoft.com/office/word/2018/wordml/cex" xmlns:w16cid="http://schemas.microsoft.com/office/word/2016/wordml/cid" xmlns:w16="http://schemas.microsoft.com/office/word/2018/wordml" xmlns:w16du="http://schemas.microsoft.com/office/word/2023/wordml/word16du" xmlns:w16sdtdh="http://schemas.microsoft.com/office/word/2020/wordml/sdtdatahash" xmlns:w16sdtfl="http://schemas.microsoft.com/office/word/2024/wordml/sdtformatlock" xmlns:w16se="http://schemas.microsoft.com/office/word/2015/wordml/symex" xmlns:wpg="http://schemas.microsoft.com/office/word/2010/wordprocessingGroup" xmlns:wpi="http://schemas.microsoft.com/office/word/2010/wordprocessingInk" xmlns:wne="http://schemas.microsoft.com/office/word/2006/wordml" xmlns:wps="http://schemas.microsoft.com/office/word/2010/wordprocessingShape" mc:Ignorable="w14 w15 w16se w16cid w16 w16cex w16sdtdh w16sdtfl w16du wp14">
   <w:p>
     <w:pPr>
@@ -6049,7 +6269,7 @@
         <w:sz w:val="16"/>
         <w:szCs w:val="16"/>
       </w:rPr>
-      <w:t>720</w:t>
+      <w:t>829</w:t>
     </w:r>
     <w:r>
       <w:rPr>
@@ -6062,6 +6282,16 @@
 </w:ftr>
 </file>
 
+<file path=word/footer3.xml><?xml version="1.0" encoding="utf-8"?>
+<w:ftr xmlns:wpc="http://schemas.microsoft.com/office/word/2010/wordprocessingCanvas" xmlns:cx="http://schemas.microsoft.com/office/drawing/2014/chartex" xmlns:cx1="http://schemas.microsoft.com/office/drawing/2015/9/8/chartex" xmlns:cx2="http://schemas.microsoft.com/office/drawing/2015/10/21/chartex" xmlns:cx3="http://schemas.microsoft.com/office/drawing/2016/5/9/chartex" xmlns:cx4="http://schemas.microsoft.com/office/drawing/2016/5/10/chartex" xmlns:cx5="http://schemas.microsoft.com/office/drawing/2016/5/11/chartex" xmlns:cx6="http://schemas.microsoft.com/office/drawing/2016/5/12/chartex" xmlns:cx7="http://schemas.microsoft.com/office/drawing/2016/5/13/chartex" xmlns:cx8="http://schemas.microsoft.com/office/drawing/2016/5/14/chartex" xmlns:mc="http://schemas.openxmlformats.org/markup-compatibility/2006" xmlns:aink="http://schemas.microsoft.com/office/drawing/2016/ink" xmlns:am3d="http://schemas.microsoft.com/office/drawing/2017/model3d" xmlns:o="urn:schemas-microsoft-com:office:office" xmlns:oel="http://schemas.microsoft.com/office/2019/extlst" xmlns:r="http://schemas.openxmlformats.org/officeDocument/2006/relationships" xmlns:m="http://schemas.openxmlformats.org/officeDocument/2006/math" xmlns:v="urn:schemas-microsoft-com:vml" xmlns:wp14="http://schemas.microsoft.com/office/word/2010/wordprocessingDrawing" xmlns:wp="http://schemas.openxmlformats.org/drawingml/2006/wordprocessingDrawing" xmlns:w10="urn:schemas-microsoft-com:office:word" xmlns:w="http://schemas.openxmlformats.org/wordprocessingml/2006/main" xmlns:w14="http://schemas.microsoft.com/office/word/2010/wordml" xmlns:w15="http://schemas.microsoft.com/office/word/2012/wordml" xmlns:w16cex="http://schemas.microsoft.com/office/word/2018/wordml/cex" xmlns:w16cid="http://schemas.microsoft.com/office/word/2016/wordml/cid" xmlns:w16="http://schemas.microsoft.com/office/word/2018/wordml" xmlns:w16du="http://schemas.microsoft.com/office/word/2023/wordml/word16du" xmlns:w16sdtdh="http://schemas.microsoft.com/office/word/2020/wordml/sdtdatahash" xmlns:w16sdtfl="http://schemas.microsoft.com/office/word/2024/wordml/sdtformatlock" xmlns:w16se="http://schemas.microsoft.com/office/word/2015/wordml/symex" xmlns:wpg="http://schemas.microsoft.com/office/word/2010/wordprocessingGroup" xmlns:wpi="http://schemas.microsoft.com/office/word/2010/wordprocessingInk" xmlns:wne="http://schemas.microsoft.com/office/word/2006/wordml" xmlns:wps="http://schemas.microsoft.com/office/word/2010/wordprocessingShape" mc:Ignorable="w14 w15 w16se w16cid w16 w16cex w16sdtdh w16sdtfl w16du wp14">
+  <w:p>
+    <w:pPr>
+      <w:pStyle w:val="Footer"/>
+    </w:pPr>
+  </w:p>
+</w:ftr>
+</file>
+
 <file path=word/footnotes.xml><?xml version="1.0" encoding="utf-8"?>
 <w:footnotes xmlns:wpc="http://schemas.microsoft.com/office/word/2010/wordprocessingCanvas" xmlns:cx="http://schemas.microsoft.com/office/drawing/2014/chartex" xmlns:cx1="http://schemas.microsoft.com/office/drawing/2015/9/8/chartex" xmlns:cx2="http://schemas.microsoft.com/office/drawing/2015/10/21/chartex" xmlns:cx3="http://schemas.microsoft.com/office/drawing/2016/5/9/chartex" xmlns:cx4="http://schemas.microsoft.com/office/drawing/2016/5/10/chartex" xmlns:cx5="http://schemas.microsoft.com/office/drawing/2016/5/11/chartex" xmlns:cx6="http://schemas.microsoft.com/office/drawing/2016/5/12/chartex" xmlns:cx7="http://schemas.microsoft.com/office/drawing/2016/5/13/chartex" xmlns:cx8="http://schemas.microsoft.com/office/drawing/2016/5/14/chartex" xmlns:mc="http://schemas.openxmlformats.org/markup-compatibility/2006" xmlns:aink="http://schemas.microsoft.com/office/drawing/2016/ink" xmlns:am3d="http://schemas.microsoft.com/office/drawing/2017/model3d" xmlns:o="urn:schemas-microsoft-com:office:office" xmlns:oel="http://schemas.microsoft.com/office/2019/extlst" xmlns:r="http://schemas.openxmlformats.org/officeDocument/2006/relationships" xmlns:m="http://schemas.openxmlformats.org/officeDocument/2006/math" xmlns:v="urn:schemas-microsoft-com:vml" xmlns:wp14="http://schemas.microsoft.com/office/word/2010/wordprocessingDrawing" xmlns:wp="http://schemas.openxmlformats.org/drawingml/2006/wordprocessingDrawing" xmlns:w10="urn:schemas-microsoft-com:office:word" xmlns:w="http://schemas.openxmlformats.org/wordprocessingml/2006/main" xmlns:w14="http://schemas.microsoft.com/office/word/2010/wordml" xmlns:w15="http://schemas.microsoft.com/office/word/2012/wordml" xmlns:w16cex="http://schemas.microsoft.com/office/word/2018/wordml/cex" xmlns:w16cid="http://schemas.microsoft.com/office/word/2016/wordml/cid" xmlns:w16="http://schemas.microsoft.com/office/word/2018/wordml" xmlns:w16du="http://schemas.microsoft.com/office/word/2023/wordml/word16du" xmlns:w16sdtdh="http://schemas.microsoft.com/office/word/2020/wordml/sdtdatahash" xmlns:w16sdtfl="http://schemas.microsoft.com/office/word/2024/wordml/sdtformatlock" xmlns:w16se="http://schemas.microsoft.com/office/word/2015/wordml/symex" xmlns:wpg="http://schemas.microsoft.com/office/word/2010/wordprocessingGroup" xmlns:wpi="http://schemas.microsoft.com/office/word/2010/wordprocessingInk" xmlns:wne="http://schemas.microsoft.com/office/word/2006/wordml" xmlns:wps="http://schemas.microsoft.com/office/word/2010/wordprocessingShape" mc:Ignorable="w14 w15 w16se w16cid w16 w16cex w16sdtdh w16sdtfl w16du wp14">
   <w:footnote w:type="separator" w:id="-1">
@@ -6079,6 +6309,36 @@
     </w:p>
   </w:footnote>
 </w:footnotes>
+</file>
+
+<file path=word/header1.xml><?xml version="1.0" encoding="utf-8"?>
+<w:hdr xmlns:wpc="http://schemas.microsoft.com/office/word/2010/wordprocessingCanvas" xmlns:cx="http://schemas.microsoft.com/office/drawing/2014/chartex" xmlns:cx1="http://schemas.microsoft.com/office/drawing/2015/9/8/chartex" xmlns:cx2="http://schemas.microsoft.com/office/drawing/2015/10/21/chartex" xmlns:cx3="http://schemas.microsoft.com/office/drawing/2016/5/9/chartex" xmlns:cx4="http://schemas.microsoft.com/office/drawing/2016/5/10/chartex" xmlns:cx5="http://schemas.microsoft.com/office/drawing/2016/5/11/chartex" xmlns:cx6="http://schemas.microsoft.com/office/drawing/2016/5/12/chartex" xmlns:cx7="http://schemas.microsoft.com/office/drawing/2016/5/13/chartex" xmlns:cx8="http://schemas.microsoft.com/office/drawing/2016/5/14/chartex" xmlns:mc="http://schemas.openxmlformats.org/markup-compatibility/2006" xmlns:aink="http://schemas.microsoft.com/office/drawing/2016/ink" xmlns:am3d="http://schemas.microsoft.com/office/drawing/2017/model3d" xmlns:o="urn:schemas-microsoft-com:office:office" xmlns:oel="http://schemas.microsoft.com/office/2019/extlst" xmlns:r="http://schemas.openxmlformats.org/officeDocument/2006/relationships" xmlns:m="http://schemas.openxmlformats.org/officeDocument/2006/math" xmlns:v="urn:schemas-microsoft-com:vml" xmlns:wp14="http://schemas.microsoft.com/office/word/2010/wordprocessingDrawing" xmlns:wp="http://schemas.openxmlformats.org/drawingml/2006/wordprocessingDrawing" xmlns:w10="urn:schemas-microsoft-com:office:word" xmlns:w="http://schemas.openxmlformats.org/wordprocessingml/2006/main" xmlns:w14="http://schemas.microsoft.com/office/word/2010/wordml" xmlns:w15="http://schemas.microsoft.com/office/word/2012/wordml" xmlns:w16cex="http://schemas.microsoft.com/office/word/2018/wordml/cex" xmlns:w16cid="http://schemas.microsoft.com/office/word/2016/wordml/cid" xmlns:w16="http://schemas.microsoft.com/office/word/2018/wordml" xmlns:w16du="http://schemas.microsoft.com/office/word/2023/wordml/word16du" xmlns:w16sdtdh="http://schemas.microsoft.com/office/word/2020/wordml/sdtdatahash" xmlns:w16sdtfl="http://schemas.microsoft.com/office/word/2024/wordml/sdtformatlock" xmlns:w16se="http://schemas.microsoft.com/office/word/2015/wordml/symex" xmlns:wpg="http://schemas.microsoft.com/office/word/2010/wordprocessingGroup" xmlns:wpi="http://schemas.microsoft.com/office/word/2010/wordprocessingInk" xmlns:wne="http://schemas.microsoft.com/office/word/2006/wordml" xmlns:wps="http://schemas.microsoft.com/office/word/2010/wordprocessingShape" mc:Ignorable="w14 w15 w16se w16cid w16 w16cex w16sdtdh w16sdtfl w16du wp14">
+  <w:p>
+    <w:pPr>
+      <w:pStyle w:val="Header"/>
+    </w:pPr>
+  </w:p>
+</w:hdr>
+</file>
+
+<file path=word/header2.xml><?xml version="1.0" encoding="utf-8"?>
+<w:hdr xmlns:wpc="http://schemas.microsoft.com/office/word/2010/wordprocessingCanvas" xmlns:cx="http://schemas.microsoft.com/office/drawing/2014/chartex" xmlns:cx1="http://schemas.microsoft.com/office/drawing/2015/9/8/chartex" xmlns:cx2="http://schemas.microsoft.com/office/drawing/2015/10/21/chartex" xmlns:cx3="http://schemas.microsoft.com/office/drawing/2016/5/9/chartex" xmlns:cx4="http://schemas.microsoft.com/office/drawing/2016/5/10/chartex" xmlns:cx5="http://schemas.microsoft.com/office/drawing/2016/5/11/chartex" xmlns:cx6="http://schemas.microsoft.com/office/drawing/2016/5/12/chartex" xmlns:cx7="http://schemas.microsoft.com/office/drawing/2016/5/13/chartex" xmlns:cx8="http://schemas.microsoft.com/office/drawing/2016/5/14/chartex" xmlns:mc="http://schemas.openxmlformats.org/markup-compatibility/2006" xmlns:aink="http://schemas.microsoft.com/office/drawing/2016/ink" xmlns:am3d="http://schemas.microsoft.com/office/drawing/2017/model3d" xmlns:o="urn:schemas-microsoft-com:office:office" xmlns:oel="http://schemas.microsoft.com/office/2019/extlst" xmlns:r="http://schemas.openxmlformats.org/officeDocument/2006/relationships" xmlns:m="http://schemas.openxmlformats.org/officeDocument/2006/math" xmlns:v="urn:schemas-microsoft-com:vml" xmlns:wp14="http://schemas.microsoft.com/office/word/2010/wordprocessingDrawing" xmlns:wp="http://schemas.openxmlformats.org/drawingml/2006/wordprocessingDrawing" xmlns:w10="urn:schemas-microsoft-com:office:word" xmlns:w="http://schemas.openxmlformats.org/wordprocessingml/2006/main" xmlns:w14="http://schemas.microsoft.com/office/word/2010/wordml" xmlns:w15="http://schemas.microsoft.com/office/word/2012/wordml" xmlns:w16cex="http://schemas.microsoft.com/office/word/2018/wordml/cex" xmlns:w16cid="http://schemas.microsoft.com/office/word/2016/wordml/cid" xmlns:w16="http://schemas.microsoft.com/office/word/2018/wordml" xmlns:w16du="http://schemas.microsoft.com/office/word/2023/wordml/word16du" xmlns:w16sdtdh="http://schemas.microsoft.com/office/word/2020/wordml/sdtdatahash" xmlns:w16sdtfl="http://schemas.microsoft.com/office/word/2024/wordml/sdtformatlock" xmlns:w16se="http://schemas.microsoft.com/office/word/2015/wordml/symex" xmlns:wpg="http://schemas.microsoft.com/office/word/2010/wordprocessingGroup" xmlns:wpi="http://schemas.microsoft.com/office/word/2010/wordprocessingInk" xmlns:wne="http://schemas.microsoft.com/office/word/2006/wordml" xmlns:wps="http://schemas.microsoft.com/office/word/2010/wordprocessingShape" mc:Ignorable="w14 w15 w16se w16cid w16 w16cex w16sdtdh w16sdtfl w16du wp14">
+  <w:p>
+    <w:pPr>
+      <w:pStyle w:val="Header"/>
+    </w:pPr>
+  </w:p>
+</w:hdr>
+</file>
+
+<file path=word/header3.xml><?xml version="1.0" encoding="utf-8"?>
+<w:hdr xmlns:wpc="http://schemas.microsoft.com/office/word/2010/wordprocessingCanvas" xmlns:cx="http://schemas.microsoft.com/office/drawing/2014/chartex" xmlns:cx1="http://schemas.microsoft.com/office/drawing/2015/9/8/chartex" xmlns:cx2="http://schemas.microsoft.com/office/drawing/2015/10/21/chartex" xmlns:cx3="http://schemas.microsoft.com/office/drawing/2016/5/9/chartex" xmlns:cx4="http://schemas.microsoft.com/office/drawing/2016/5/10/chartex" xmlns:cx5="http://schemas.microsoft.com/office/drawing/2016/5/11/chartex" xmlns:cx6="http://schemas.microsoft.com/office/drawing/2016/5/12/chartex" xmlns:cx7="http://schemas.microsoft.com/office/drawing/2016/5/13/chartex" xmlns:cx8="http://schemas.microsoft.com/office/drawing/2016/5/14/chartex" xmlns:mc="http://schemas.openxmlformats.org/markup-compatibility/2006" xmlns:aink="http://schemas.microsoft.com/office/drawing/2016/ink" xmlns:am3d="http://schemas.microsoft.com/office/drawing/2017/model3d" xmlns:o="urn:schemas-microsoft-com:office:office" xmlns:oel="http://schemas.microsoft.com/office/2019/extlst" xmlns:r="http://schemas.openxmlformats.org/officeDocument/2006/relationships" xmlns:m="http://schemas.openxmlformats.org/officeDocument/2006/math" xmlns:v="urn:schemas-microsoft-com:vml" xmlns:wp14="http://schemas.microsoft.com/office/word/2010/wordprocessingDrawing" xmlns:wp="http://schemas.openxmlformats.org/drawingml/2006/wordprocessingDrawing" xmlns:w10="urn:schemas-microsoft-com:office:word" xmlns:w="http://schemas.openxmlformats.org/wordprocessingml/2006/main" xmlns:w14="http://schemas.microsoft.com/office/word/2010/wordml" xmlns:w15="http://schemas.microsoft.com/office/word/2012/wordml" xmlns:w16cex="http://schemas.microsoft.com/office/word/2018/wordml/cex" xmlns:w16cid="http://schemas.microsoft.com/office/word/2016/wordml/cid" xmlns:w16="http://schemas.microsoft.com/office/word/2018/wordml" xmlns:w16du="http://schemas.microsoft.com/office/word/2023/wordml/word16du" xmlns:w16sdtdh="http://schemas.microsoft.com/office/word/2020/wordml/sdtdatahash" xmlns:w16sdtfl="http://schemas.microsoft.com/office/word/2024/wordml/sdtformatlock" xmlns:w16se="http://schemas.microsoft.com/office/word/2015/wordml/symex" xmlns:wpg="http://schemas.microsoft.com/office/word/2010/wordprocessingGroup" xmlns:wpi="http://schemas.microsoft.com/office/word/2010/wordprocessingInk" xmlns:wne="http://schemas.microsoft.com/office/word/2006/wordml" xmlns:wps="http://schemas.microsoft.com/office/word/2010/wordprocessingShape" mc:Ignorable="w14 w15 w16se w16cid w16 w16cex w16sdtdh w16sdtfl w16du wp14">
+  <w:p>
+    <w:pPr>
+      <w:pStyle w:val="Header"/>
+    </w:pPr>
+  </w:p>
+</w:hdr>
 </file>
 
 <file path=word/numbering.xml><?xml version="1.0" encoding="utf-8"?>
@@ -7608,15 +7868,17 @@
     <w:charset w:val="00"/>
     <w:family w:val="swiss"/>
     <w:pitch w:val="variable"/>
-    <w:sig w:usb0="E4002EFF" w:usb1="C000247B" w:usb2="00000009" w:usb3="00000000" w:csb0="000001FF" w:csb1="00000000"/>
+    <w:sig w:usb0="E0002AFF" w:usb1="C000247B" w:usb2="00000009" w:usb3="00000000" w:csb0="000001FF" w:csb1="00000000"/>
   </w:font>
   <w:font w:name="Aptos">
+    <w:panose1 w:val="020B0004020202020204"/>
     <w:charset w:val="00"/>
     <w:family w:val="swiss"/>
     <w:pitch w:val="variable"/>
     <w:sig w:usb0="20000287" w:usb1="00000003" w:usb2="00000000" w:usb3="00000000" w:csb0="0000019F" w:csb1="00000000"/>
   </w:font>
   <w:font w:name="Aptos Display">
+    <w:panose1 w:val="020B0004020202020204"/>
     <w:charset w:val="00"/>
     <w:family w:val="swiss"/>
     <w:pitch w:val="variable"/>
@@ -7645,9 +7907,11 @@
     <w:rsid w:val="001A2FC9"/>
     <w:rsid w:val="001A5E11"/>
     <w:rsid w:val="002977D2"/>
+    <w:rsid w:val="0036060B"/>
     <w:rsid w:val="003C4BCC"/>
     <w:rsid w:val="003C70C8"/>
     <w:rsid w:val="00401918"/>
+    <w:rsid w:val="004336FB"/>
     <w:rsid w:val="004F2A52"/>
     <w:rsid w:val="00536FED"/>
     <w:rsid w:val="0054476F"/>
@@ -7658,15 +7922,20 @@
     <w:rsid w:val="007574E7"/>
     <w:rsid w:val="007F3CE4"/>
     <w:rsid w:val="008276BC"/>
+    <w:rsid w:val="00853C0A"/>
     <w:rsid w:val="00873989"/>
     <w:rsid w:val="008805CE"/>
     <w:rsid w:val="008D0062"/>
     <w:rsid w:val="00907487"/>
+    <w:rsid w:val="00913E3B"/>
     <w:rsid w:val="00956507"/>
+    <w:rsid w:val="009823E9"/>
     <w:rsid w:val="00A442DB"/>
     <w:rsid w:val="00A456C2"/>
     <w:rsid w:val="00AA1E0F"/>
+    <w:rsid w:val="00B0789E"/>
     <w:rsid w:val="00B41ABE"/>
+    <w:rsid w:val="00BD226F"/>
     <w:rsid w:val="00C30937"/>
     <w:rsid w:val="00C70D8D"/>
     <w:rsid w:val="00C96A04"/>

</xml_diff>